<commit_message>
Update course assignment document
</commit_message>
<xml_diff>
--- a/docs/计算机_期末作业.docx
+++ b/docs/计算机_期末作业.docx
@@ -1,8 +1,19 @@
 
 <file path=word/document.xml><?xml version="1.0" encoding="utf-8"?>
-<w:document xmlns:wpc="http://schemas.microsoft.com/office/word/2010/wordprocessingCanvas" xmlns:cx="http://schemas.microsoft.com/office/drawing/2014/chartex" xmlns:cx1="http://schemas.microsoft.com/office/drawing/2015/9/8/chartex" xmlns:cx2="http://schemas.microsoft.com/office/drawing/2015/10/21/chartex" xmlns:cx3="http://schemas.microsoft.com/office/drawing/2016/5/9/chartex" xmlns:cx4="http://schemas.microsoft.com/office/drawing/2016/5/10/chartex" xmlns:cx5="http://schemas.microsoft.com/office/drawing/2016/5/11/chartex" xmlns:cx6="http://schemas.microsoft.com/office/drawing/2016/5/12/chartex" xmlns:cx7="http://schemas.microsoft.com/office/drawing/2016/5/13/chartex" xmlns:cx8="http://schemas.microsoft.com/office/drawing/2016/5/14/chartex" xmlns:mc="http://schemas.openxmlformats.org/markup-compatibility/2006" xmlns:aink="http://schemas.microsoft.com/office/drawing/2016/ink" xmlns:am3d="http://schemas.microsoft.com/office/drawing/2017/model3d" xmlns:o="urn:schemas-microsoft-com:office:office" xmlns:oel="http://schemas.microsoft.com/office/2019/extlst" xmlns:r="http://schemas.openxmlformats.org/officeDocument/2006/relationships" xmlns:m="http://schemas.openxmlformats.org/officeDocument/2006/math" xmlns:v="urn:schemas-microsoft-com:vml" xmlns:wp14="http://schemas.microsoft.com/office/word/2010/wordprocessingDrawing" xmlns:wp="http://schemas.openxmlformats.org/drawingml/2006/wordprocessingDrawing" xmlns:w10="urn:schemas-microsoft-com:office:word" xmlns:w="http://schemas.openxmlformats.org/wordprocessingml/2006/main" xmlns:w14="http://schemas.microsoft.com/office/word/2010/wordml" xmlns:w15="http://schemas.microsoft.com/office/word/2012/wordml" xmlns:w16cex="http://schemas.microsoft.com/office/word/2018/wordml/cex" xmlns:w16cid="http://schemas.microsoft.com/office/word/2016/wordml/cid" xmlns:w16="http://schemas.microsoft.com/office/word/2018/wordml" xmlns:w16du="http://schemas.microsoft.com/office/word/2023/wordml/word16du" xmlns:w16sdtdh="http://schemas.microsoft.com/office/word/2020/wordml/sdtdatahash" xmlns:w16se="http://schemas.microsoft.com/office/word/2015/wordml/symex" xmlns:wpg="http://schemas.microsoft.com/office/word/2010/wordprocessingGroup" xmlns:wpi="http://schemas.microsoft.com/office/word/2010/wordprocessingInk" xmlns:wne="http://schemas.microsoft.com/office/word/2006/wordml" xmlns:wps="http://schemas.microsoft.com/office/word/2010/wordprocessingShape" mc:Ignorable="w14 w15 w16se w16cid w16 w16cex w16sdtdh w16du wp14">
+<w:document xmlns:wpc="http://schemas.microsoft.com/office/word/2010/wordprocessingCanvas" xmlns:cx="http://schemas.microsoft.com/office/drawing/2014/chartex" xmlns:cx1="http://schemas.microsoft.com/office/drawing/2015/9/8/chartex" xmlns:cx2="http://schemas.microsoft.com/office/drawing/2015/10/21/chartex" xmlns:cx3="http://schemas.microsoft.com/office/drawing/2016/5/9/chartex" xmlns:cx4="http://schemas.microsoft.com/office/drawing/2016/5/10/chartex" xmlns:cx5="http://schemas.microsoft.com/office/drawing/2016/5/11/chartex" xmlns:cx6="http://schemas.microsoft.com/office/drawing/2016/5/12/chartex" xmlns:cx7="http://schemas.microsoft.com/office/drawing/2016/5/13/chartex" xmlns:cx8="http://schemas.microsoft.com/office/drawing/2016/5/14/chartex" xmlns:mc="http://schemas.openxmlformats.org/markup-compatibility/2006" xmlns:aink="http://schemas.microsoft.com/office/drawing/2016/ink" xmlns:am3d="http://schemas.microsoft.com/office/drawing/2017/model3d" xmlns:o="urn:schemas-microsoft-com:office:office" xmlns:oel="http://schemas.microsoft.com/office/2019/extlst" xmlns:r="http://schemas.openxmlformats.org/officeDocument/2006/relationships" xmlns:m="http://schemas.openxmlformats.org/officeDocument/2006/math" xmlns:v="urn:schemas-microsoft-com:vml" xmlns:wp14="http://schemas.microsoft.com/office/word/2010/wordprocessingDrawing" xmlns:wp="http://schemas.openxmlformats.org/drawingml/2006/wordprocessingDrawing" xmlns:w10="urn:schemas-microsoft-com:office:word" xmlns:w="http://schemas.openxmlformats.org/wordprocessingml/2006/main" xmlns:w14="http://schemas.microsoft.com/office/word/2010/wordml" xmlns:w15="http://schemas.microsoft.com/office/word/2012/wordml" xmlns:w16cex="http://schemas.microsoft.com/office/word/2018/wordml/cex" xmlns:w16cid="http://schemas.microsoft.com/office/word/2016/wordml/cid" xmlns:w16="http://schemas.microsoft.com/office/word/2018/wordml" xmlns:w16du="http://schemas.microsoft.com/office/word/2023/wordml/word16du" xmlns:w16sdtdh="http://schemas.microsoft.com/office/word/2020/wordml/sdtdatahash" xmlns:w16sdtfl="http://schemas.microsoft.com/office/word/2024/wordml/sdtformatlock" xmlns:w16se="http://schemas.microsoft.com/office/word/2015/wordml/symex" xmlns:wpg="http://schemas.microsoft.com/office/word/2010/wordprocessingGroup" xmlns:wpi="http://schemas.microsoft.com/office/word/2010/wordprocessingInk" xmlns:wne="http://schemas.microsoft.com/office/word/2006/wordml" xmlns:wps="http://schemas.microsoft.com/office/word/2010/wordprocessingShape" mc:Ignorable="w14 w15 w16se w16cid w16 w16cex w16sdtdh w16sdtfl w16du wp14">
   <w:body>
     <w:p>
+      <w:pPr>
+        <w:rPr>
+          <w:rFonts w:hint="eastAsia"/>
+        </w:rPr>
+      </w:pPr>
+      <w:r>
+        <w:rPr>
+          <w:rFonts w:hint="eastAsia"/>
+        </w:rPr>
+        <w:t>Java语言</w:t>
+      </w:r>
       <w:r>
         <w:rPr>
           <w:rFonts w:hint="eastAsia"/>
@@ -55,8 +66,19 @@
         <w:t>简易聊天室程序</w:t>
       </w:r>
     </w:p>
-    <w:p/>
-    <w:p>
+    <w:p>
+      <w:pPr>
+        <w:rPr>
+          <w:rFonts w:hint="eastAsia"/>
+        </w:rPr>
+      </w:pPr>
+    </w:p>
+    <w:p>
+      <w:pPr>
+        <w:rPr>
+          <w:rFonts w:hint="eastAsia"/>
+        </w:rPr>
+      </w:pPr>
       <w:r>
         <w:rPr>
           <w:rFonts w:hint="eastAsia"/>
@@ -65,6 +87,11 @@
       </w:r>
     </w:p>
     <w:p>
+      <w:pPr>
+        <w:rPr>
+          <w:rFonts w:hint="eastAsia"/>
+        </w:rPr>
+      </w:pPr>
       <w:r>
         <w:rPr>
           <w:rFonts w:hint="eastAsia"/>
@@ -93,6 +120,11 @@
       </w:r>
     </w:p>
     <w:p>
+      <w:pPr>
+        <w:rPr>
+          <w:rFonts w:hint="eastAsia"/>
+        </w:rPr>
+      </w:pPr>
       <w:r>
         <w:t>1、</w:t>
       </w:r>
@@ -175,6 +207,11 @@
       </w:r>
     </w:p>
     <w:p>
+      <w:pPr>
+        <w:rPr>
+          <w:rFonts w:hint="eastAsia"/>
+        </w:rPr>
+      </w:pPr>
       <w:r>
         <w:t>2、</w:t>
       </w:r>
@@ -195,6 +232,11 @@
       </w:r>
     </w:p>
     <w:p>
+      <w:pPr>
+        <w:rPr>
+          <w:rFonts w:hint="eastAsia"/>
+        </w:rPr>
+      </w:pPr>
       <w:r>
         <w:t>3、</w:t>
       </w:r>
@@ -245,6 +287,11 @@
       </w:r>
     </w:p>
     <w:p>
+      <w:pPr>
+        <w:rPr>
+          <w:rFonts w:hint="eastAsia"/>
+        </w:rPr>
+      </w:pPr>
       <w:r>
         <w:t>4</w:t>
       </w:r>
@@ -256,6 +303,11 @@
       </w:r>
     </w:p>
     <w:p>
+      <w:pPr>
+        <w:rPr>
+          <w:rFonts w:hint="eastAsia"/>
+        </w:rPr>
+      </w:pPr>
       <w:r>
         <w:t>5</w:t>
       </w:r>
@@ -279,6 +331,11 @@
       </w:r>
     </w:p>
     <w:p>
+      <w:pPr>
+        <w:rPr>
+          <w:rFonts w:hint="eastAsia"/>
+        </w:rPr>
+      </w:pPr>
       <w:r>
         <w:t>6</w:t>
       </w:r>
@@ -330,6 +387,11 @@
       </w:pPr>
     </w:p>
     <w:p>
+      <w:pPr>
+        <w:rPr>
+          <w:rFonts w:hint="eastAsia"/>
+        </w:rPr>
+      </w:pPr>
       <w:r>
         <w:rPr>
           <w:rFonts w:hint="eastAsia"/>
@@ -338,6 +400,11 @@
       </w:r>
     </w:p>
     <w:p>
+      <w:pPr>
+        <w:rPr>
+          <w:rFonts w:hint="eastAsia"/>
+        </w:rPr>
+      </w:pPr>
       <w:r>
         <w:t>1、</w:t>
       </w:r>
@@ -361,6 +428,11 @@
       </w:r>
     </w:p>
     <w:p>
+      <w:pPr>
+        <w:rPr>
+          <w:rFonts w:hint="eastAsia"/>
+        </w:rPr>
+      </w:pPr>
       <w:r>
         <w:t>2、</w:t>
       </w:r>
@@ -372,6 +444,11 @@
       </w:r>
     </w:p>
     <w:p>
+      <w:pPr>
+        <w:rPr>
+          <w:rFonts w:hint="eastAsia"/>
+        </w:rPr>
+      </w:pPr>
       <w:r>
         <w:t>3、</w:t>
       </w:r>
@@ -395,6 +472,11 @@
       </w:r>
     </w:p>
     <w:p>
+      <w:pPr>
+        <w:rPr>
+          <w:rFonts w:hint="eastAsia"/>
+        </w:rPr>
+      </w:pPr>
       <w:r>
         <w:t>4</w:t>
       </w:r>
@@ -434,6 +516,11 @@
       </w:r>
     </w:p>
     <w:p>
+      <w:pPr>
+        <w:rPr>
+          <w:rFonts w:hint="eastAsia"/>
+        </w:rPr>
+      </w:pPr>
       <w:r>
         <w:t>5</w:t>
       </w:r>
@@ -549,6 +636,11 @@
       </w:r>
     </w:p>
     <w:p>
+      <w:pPr>
+        <w:rPr>
+          <w:rFonts w:hint="eastAsia"/>
+        </w:rPr>
+      </w:pPr>
       <w:r>
         <w:t>6</w:t>
       </w:r>
@@ -627,44 +719,25 @@
         <w:t>，还是实名聊天。</w:t>
       </w:r>
     </w:p>
-    <w:p/>
-    <w:p>
-      <w:r>
-        <w:rPr>
-          <w:rFonts w:hint="eastAsia"/>
-        </w:rPr>
-        <w:t>验收时间：</w:t>
-      </w:r>
-      <w:r>
-        <w:t>20</w:t>
-      </w:r>
-      <w:r>
-        <w:rPr>
-          <w:rFonts w:hint="eastAsia"/>
-        </w:rPr>
-        <w:t>24</w:t>
-      </w:r>
-      <w:r>
-        <w:t>年6月</w:t>
-      </w:r>
-      <w:r>
-        <w:rPr>
-          <w:rFonts w:hint="eastAsia"/>
-        </w:rPr>
-        <w:t>21日</w:t>
-      </w:r>
-      <w:r>
-        <w:t>。</w:t>
-      </w:r>
-      <w:r>
-        <w:rPr>
-          <w:rFonts w:hint="eastAsia"/>
-        </w:rPr>
-        <w:t>具体时间地点待定。</w:t>
-      </w:r>
-    </w:p>
-    <w:p/>
-    <w:p>
+    <w:p>
+      <w:pPr>
+        <w:rPr>
+          <w:rFonts w:hint="eastAsia"/>
+        </w:rPr>
+      </w:pPr>
+    </w:p>
+    <w:p>
+      <w:pPr>
+        <w:rPr>
+          <w:rFonts w:hint="eastAsia"/>
+        </w:rPr>
+      </w:pPr>
+      <w:r>
+        <w:rPr>
+          <w:rFonts w:hint="eastAsia"/>
+        </w:rPr>
+        <w:t>编写</w:t>
+      </w:r>
       <w:r>
         <w:rPr>
           <w:rFonts w:hint="eastAsia"/>
@@ -673,6 +746,11 @@
       </w:r>
     </w:p>
     <w:p>
+      <w:pPr>
+        <w:rPr>
+          <w:rFonts w:hint="eastAsia"/>
+        </w:rPr>
+      </w:pPr>
       <w:r>
         <w:rPr>
           <w:rFonts w:hint="eastAsia"/>
@@ -681,6 +759,11 @@
       </w:r>
     </w:p>
     <w:p>
+      <w:pPr>
+        <w:rPr>
+          <w:rFonts w:hint="eastAsia"/>
+        </w:rPr>
+      </w:pPr>
       <w:r>
         <w:rPr>
           <w:rFonts w:hint="eastAsia"/>
@@ -688,116 +771,19 @@
         <w:t>使用说明，类的关系。</w:t>
       </w:r>
     </w:p>
-    <w:p/>
-    <w:p>
-      <w:r>
-        <w:rPr>
-          <w:rFonts w:hint="eastAsia"/>
-        </w:rPr>
-        <w:t>提交要求：</w:t>
-      </w:r>
-    </w:p>
-    <w:p>
-      <w:r>
-        <w:rPr>
-          <w:rFonts w:hint="eastAsia"/>
-        </w:rPr>
-        <w:t>作业提交时间：</w:t>
-      </w:r>
-      <w:r>
-        <w:rPr>
-          <w:rFonts w:hint="eastAsia"/>
-        </w:rPr>
-        <w:t>验收后一周内</w:t>
-      </w:r>
-      <w:r>
-        <w:t>。</w:t>
-      </w:r>
-    </w:p>
-    <w:p/>
-    <w:p>
-      <w:r>
-        <w:rPr>
-          <w:rFonts w:hint="eastAsia"/>
-        </w:rPr>
-        <w:t>提交文件命名要求：</w:t>
-      </w:r>
-    </w:p>
-    <w:p>
-      <w:r>
-        <w:rPr>
-          <w:rFonts w:hint="eastAsia"/>
-        </w:rPr>
-        <w:t>请大家严格按照下述要求进行命名，否则</w:t>
-      </w:r>
-      <w:r>
-        <w:rPr>
-          <w:rFonts w:hint="eastAsia"/>
-        </w:rPr>
-        <w:t>有可能找不到你的作业从而没有成绩！</w:t>
-      </w:r>
-    </w:p>
-    <w:p>
-      <w:r>
-        <w:t xml:space="preserve">1、只提交源代码，不要提交工程； </w:t>
-      </w:r>
-    </w:p>
-    <w:p>
-      <w:r>
-        <w:t>2、将所有源代码放到一个</w:t>
-      </w:r>
-      <w:r>
-        <w:rPr>
-          <w:rFonts w:hint="eastAsia"/>
-        </w:rPr>
-        <w:t>名字为学号的目录下</w:t>
-      </w:r>
-      <w:r>
-        <w:t>；</w:t>
-      </w:r>
-    </w:p>
-    <w:p>
-      <w:r>
-        <w:t>3、</w:t>
-      </w:r>
-      <w:r>
-        <w:rPr>
-          <w:rFonts w:hint="eastAsia"/>
-        </w:rPr>
-        <w:t>将</w:t>
-      </w:r>
-      <w:r>
-        <w:t>文档、</w:t>
-      </w:r>
-      <w:r>
-        <w:rPr>
-          <w:rFonts w:hint="eastAsia"/>
-        </w:rPr>
-        <w:t>源代码</w:t>
-      </w:r>
-      <w:r>
-        <w:rPr>
-          <w:rFonts w:hint="eastAsia"/>
-        </w:rPr>
-        <w:t>、用户文件</w:t>
-      </w:r>
-      <w:r>
-        <w:rPr>
-          <w:rFonts w:hint="eastAsia"/>
-        </w:rPr>
-        <w:t>等压缩成一个文件提交；</w:t>
-      </w:r>
-    </w:p>
-    <w:p>
-      <w:r>
-        <w:rPr>
-          <w:rFonts w:hint="eastAsia"/>
-        </w:rPr>
-        <w:t>4、文档、</w:t>
-      </w:r>
-      <w:r>
-        <w:t>压缩文件及邮件标题命名格式统一为：班级+学号+姓名。</w:t>
-      </w:r>
+    <w:p>
+      <w:pPr>
+        <w:rPr>
+          <w:rFonts w:hint="eastAsia"/>
+        </w:rPr>
+      </w:pPr>
+    </w:p>
+    <w:p>
+      <w:pPr>
+        <w:rPr>
+          <w:rFonts w:hint="eastAsia"/>
+        </w:rPr>
+      </w:pPr>
     </w:p>
     <w:sectPr>
       <w:pgSz w:w="11906" w:h="16838"/>
@@ -810,7 +796,7 @@
 </file>
 
 <file path=word/styles.xml><?xml version="1.0" encoding="utf-8"?>
-<w:styles xmlns:mc="http://schemas.openxmlformats.org/markup-compatibility/2006" xmlns:r="http://schemas.openxmlformats.org/officeDocument/2006/relationships" xmlns:w="http://schemas.openxmlformats.org/wordprocessingml/2006/main" xmlns:w14="http://schemas.microsoft.com/office/word/2010/wordml" xmlns:w15="http://schemas.microsoft.com/office/word/2012/wordml" xmlns:w16cex="http://schemas.microsoft.com/office/word/2018/wordml/cex" xmlns:w16cid="http://schemas.microsoft.com/office/word/2016/wordml/cid" xmlns:w16="http://schemas.microsoft.com/office/word/2018/wordml" xmlns:w16du="http://schemas.microsoft.com/office/word/2023/wordml/word16du" xmlns:w16sdtdh="http://schemas.microsoft.com/office/word/2020/wordml/sdtdatahash" xmlns:w16se="http://schemas.microsoft.com/office/word/2015/wordml/symex" mc:Ignorable="w14 w15 w16se w16cid w16 w16cex w16sdtdh w16du">
+<w:styles xmlns:mc="http://schemas.openxmlformats.org/markup-compatibility/2006" xmlns:r="http://schemas.openxmlformats.org/officeDocument/2006/relationships" xmlns:w="http://schemas.openxmlformats.org/wordprocessingml/2006/main" xmlns:w14="http://schemas.microsoft.com/office/word/2010/wordml" xmlns:w15="http://schemas.microsoft.com/office/word/2012/wordml" xmlns:w16cex="http://schemas.microsoft.com/office/word/2018/wordml/cex" xmlns:w16cid="http://schemas.microsoft.com/office/word/2016/wordml/cid" xmlns:w16="http://schemas.microsoft.com/office/word/2018/wordml" xmlns:w16du="http://schemas.microsoft.com/office/word/2023/wordml/word16du" xmlns:w16sdtdh="http://schemas.microsoft.com/office/word/2020/wordml/sdtdatahash" xmlns:w16sdtfl="http://schemas.microsoft.com/office/word/2024/wordml/sdtformatlock" xmlns:w16se="http://schemas.microsoft.com/office/word/2015/wordml/symex" mc:Ignorable="w14 w15 w16se w16cid w16 w16cex w16sdtdh w16sdtfl w16du">
   <w:docDefaults>
     <w:rPrDefault>
       <w:rPr>

</xml_diff>